<commit_message>
docs: add study dossier; correct stale primary-endpoint statements
The primary test was corrected to the arm x site interaction in 997ee5f,
but four documents still described the within-participant paired contrast
as the primary endpoint. Corrected in the IRB protocol (design overview and
the power-section heading), the technical acquisition standard (three
places) and the statistician onboarding letter, which is the one document
going to an external reader as a design summary.

Adds SPARKLE-STUDY-DOSSIER.md: a single-file record of the design, the
numbers, the hardware constraints, the rejected approaches and the reasons
for them, so settled questions are not reopened. Adds a repository CLAUDE.md
pointing to it.

Deliverables regenerated: IRB 45pp, Technical 23pp, Review 17pp, Letter 5pp.

Co-Authored-By: Claude Opus 5 <noreply@anthropic.com>
Claude-Session: https://claude.ai/code/session_015bGV3JxPCxzCiLxvqqXxkf
</commit_message>
<xml_diff>
--- a/deliverables/Sparkle-Study-IRB-Protocol.docx
+++ b/deliverables/Sparkle-Study-IRB-Protocol.docx
@@ -1610,7 +1610,23 @@
         <w:t xml:space="preserve"> </w:t>
       </w:r>
       <w:r>
-        <w:t xml:space="preserve">(affected site vs the participant’s own upper abdomen) serving the primary endpoint.</w:t>
+        <w:t xml:space="preserve">(affected site vs the participant’s own upper abdomen), computed in both arms, whose</w:t>
+      </w:r>
+      <w:r>
+        <w:t xml:space="preserve"> </w:t>
+      </w:r>
+      <w:r>
+        <w:rPr>
+          <w:b/>
+          <w:bCs/>
+        </w:rPr>
+        <w:t xml:space="preserve">arm × site interaction</w:t>
+      </w:r>
+      <w:r>
+        <w:t xml:space="preserve"> </w:t>
+      </w:r>
+      <w:r>
+        <w:t xml:space="preserve">is the primary test (§8.2).</w:t>
       </w:r>
     </w:p>
     <w:p>
@@ -6908,13 +6924,37 @@
         <w:t xml:space="preserve">That is the correct trade-off for a discovery study, and it is stated as such rather than disguised.</w:t>
       </w:r>
     </w:p>
-    <w:bookmarkStart w:id="75" w:name="Xe43db804e40e7e143760e7d8ce45fcc500cd2a3"/>
+    <w:bookmarkStart w:id="75" w:name="Xca91063db618e69ee5dfddfb36dac0dddef297f"/>
     <w:p>
       <w:pPr>
         <w:pStyle w:val="Heading3"/>
       </w:pPr>
       <w:r>
-        <w:t xml:space="preserve">H1 — primary endpoint (paired, within-subject, n = 50 lipoedema)</w:t>
+        <w:t xml:space="preserve">H1 — primary endpoint, paired-contrast approximation (within-subject, n = 50 lipoedema)</w:t>
+      </w:r>
+    </w:p>
+    <w:p>
+      <w:pPr>
+        <w:pStyle w:val="BlockText"/>
+      </w:pPr>
+      <w:r>
+        <w:t xml:space="preserve">The primary test is the</w:t>
+      </w:r>
+      <w:r>
+        <w:t xml:space="preserve"> </w:t>
+      </w:r>
+      <w:r>
+        <w:rPr>
+          <w:b/>
+          <w:bCs/>
+        </w:rPr>
+        <w:t xml:space="preserve">arm × site interaction</w:t>
+      </w:r>
+      <w:r>
+        <w:t xml:space="preserve"> </w:t>
+      </w:r>
+      <w:r>
+        <w:t xml:space="preserve">(§8.2). The figures below are computed for the within-Arm-A paired contrast, which is an approximation to it and generally optimistic. Correcting this is task 1 for the study statistician (§15).</w:t>
       </w:r>
     </w:p>
     <w:p>

</xml_diff>